<commit_message>
feat(docx-standardizer/generate_samples): sample_policy 补 Records + References 让其跑 OK，演示 1 OK + 2 PARTIAL 混合三态
Co-Authored-By: Claude Opus 4.7 (1M context) <noreply@anthropic.com>
</commit_message>
<xml_diff>
--- a/docx-standardizer/input/sample_policy.docx
+++ b/docx-standardizer/input/sample_policy.docx
@@ -44,6 +44,16 @@
     <w:p>
       <w:r>
         <w:t>Responsibilities: IT enforces, Legal interprets.</w:t>
+      </w:r>
+    </w:p>
+    <w:p>
+      <w:r>
+        <w:t>Records: signed acknowledgment form, annual training completion log.</w:t>
+      </w:r>
+    </w:p>
+    <w:p>
+      <w:r>
+        <w:t>References: ISO 27001 Annex A.6, NIST SP 800-53 AC-1.</w:t>
       </w:r>
     </w:p>
     <w:sectPr>

</xml_diff>